<commit_message>
Add the sequence, activity and ERD figures to the paper
Figures 2-4 follow the concept map, each with a caption in the document's
existing style and a descriptive paragraph. The activity diagram is split
at a connector-only gap into (a) and (b) so it stays legible on a portrait
page; the two halves are committed to docs/diagrams alongside the original.

Co-Authored-By: Claude Opus 5 <noreply@anthropic.com>
</commit_message>
<xml_diff>
--- a/docs/softengpaper-FocusFlow.docx
+++ b/docs/softengpaper-FocusFlow.docx
@@ -3208,6 +3208,7 @@
     </w:p>
     <w:p>
       <w:pPr>
+        <w:keepNext/>
         <w:pBdr>
           <w:top w:val="nil"/>
           <w:left w:val="nil"/>
@@ -3241,6 +3242,7 @@
     </w:p>
     <w:p>
       <w:pPr>
+        <w:spacing w:before="0" w:after="120" w:line="240" w:lineRule="auto"/>
         <w:jc w:val="center"/>
       </w:pPr>
       <w:bookmarkStart w:id="17" w:name="_mhlb0y5blx8u" w:colFirst="0" w:colLast="0"/>
@@ -3300,6 +3302,429 @@
           <w:sz w:val="24"/>
         </w:rPr>
         <w:t xml:space="preserve">Figure 1 situates FocusFlow in its problem space and traces its pipeline. Ongoing ADHD management relies on brief in-clinic observation and retrospective recall, so day-to-day content is chosen by guesswork; existing device-camera eye-tracking research, meanwhile, is directed at diagnostic classification. Together these leave the research gap the system addresses: actionable, per-content attention feedback for the individual. FocusFlow senses through the front camera, processes every frame on the device with the MediaPipe Face Landmarker, and combines gaze deflection with head pose into a per-frame screen-attention decision; a temporal layer measures screen-attention proportion, gaze shifts, blink count, and time to first sustained lapse, ending a clip early on a sustained drop. Clips come from a curated nine-category library in randomized order, each followed by two self-ratings. These feed a six-component per-category score, released as a ranked profile only after five successful assessments; trait clusters aggregated across the strongest categories yield a learning style, from which study techniques, content formats, and weekly goals are generated for the dashboard and PDF report, which the user may share as observational context. Derived metrics are kept locally and only account data remotely; the privacy boundary — frames processed in memory and discarded — bounds the whole pipeline, and the system is explicitly not a diagnostic or screening tool.</w:t>
+      </w:r>
+    </w:p>
+    <w:p>
+      <w:pPr>
+        <w:pStyle w:val="Heading3"/>
+        <w:pageBreakBefore/>
+        <w:spacing w:before="280" w:after="280" w:line="480" w:lineRule="auto"/>
+        <w:rPr>
+          <w:rFonts w:ascii="Arial Narrow" w:eastAsia="Arial Narrow" w:hAnsi="Arial Narrow" w:cs="Arial Narrow"/>
+          <w:color w:val="000000"/>
+          <w:sz w:val="24"/>
+          <w:szCs w:val="24"/>
+        </w:rPr>
+      </w:pPr>
+      <w:r>
+        <w:rPr>
+          <w:rFonts w:ascii="Arial Narrow" w:eastAsia="Arial Narrow" w:hAnsi="Arial Narrow" w:cs="Arial Narrow"/>
+          <w:color w:val="000000"/>
+          <w:sz w:val="24"/>
+          <w:szCs w:val="24"/>
+        </w:rPr>
+        <w:t xml:space="preserve">Sequence Diagram</w:t>
+      </w:r>
+    </w:p>
+    <w:p>
+      <w:pPr>
+        <w:keepNext/>
+        <w:pBdr>
+          <w:top w:val="nil"/>
+          <w:left w:val="nil"/>
+          <w:bottom w:val="nil"/>
+          <w:right w:val="nil"/>
+          <w:between w:val="nil"/>
+        </w:pBdr>
+        <w:spacing w:after="200" w:line="240" w:lineRule="auto"/>
+        <w:rPr>
+          <w:rFonts w:ascii="Arial Narrow" w:eastAsia="Arial Narrow" w:hAnsi="Arial Narrow" w:cs="Arial Narrow"/>
+          <w:i/>
+          <w:iCs/>
+          <w:color w:val="44546A"/>
+          <w:sz w:val="18"/>
+          <w:szCs w:val="18"/>
+        </w:rPr>
+      </w:pPr>
+      <w:r>
+        <w:rPr>
+          <w:rFonts w:ascii="Arial Narrow" w:eastAsia="Arial Narrow" w:hAnsi="Arial Narrow" w:cs="Arial Narrow"/>
+          <w:i/>
+          <w:iCs/>
+          <w:color w:val="44546A"/>
+          <w:sz w:val="18"/>
+          <w:szCs w:val="18"/>
+        </w:rPr>
+        <w:t xml:space="preserve">Figure 2 Sequence Diagram</w:t>
+      </w:r>
+    </w:p>
+    <w:p>
+      <w:pPr>
+        <w:spacing w:before="0" w:after="120" w:line="240" w:lineRule="auto"/>
+        <w:jc w:val="center"/>
+      </w:pPr>
+      <w:r>
+        <w:drawing>
+          <wp:inline distT="0" distB="0" distL="0" distR="0">
+            <wp:extent cx="5486400" cy="6508102"/>
+            <wp:effectExtent l="0" t="0" r="0" b="0"/>
+            <wp:docPr id="10" name="fig_sequence.png"/>
+            <wp:cNvGraphicFramePr/>
+            <a:graphic xmlns:a="http://schemas.openxmlformats.org/drawingml/2006/main">
+              <a:graphicData uri="http://schemas.openxmlformats.org/drawingml/2006/picture">
+                <pic:pic xmlns:pic="http://schemas.openxmlformats.org/drawingml/2006/picture">
+                  <pic:nvPicPr>
+                    <pic:cNvPr id="0" name="fig_sequence.png"/>
+                    <pic:cNvPicPr preferRelativeResize="0"/>
+                  </pic:nvPicPr>
+                  <pic:blipFill>
+                    <a:blip r:embed="rId100"/>
+                    <a:srcRect/>
+                    <a:stretch>
+                      <a:fillRect/>
+                    </a:stretch>
+                  </pic:blipFill>
+                  <pic:spPr>
+                    <a:xfrm>
+                      <a:off x="0" y="0"/>
+                      <a:ext cx="5486400" cy="6508102"/>
+                    </a:xfrm>
+                    <a:prstGeom prst="rect">
+                      <a:avLst/>
+                    </a:prstGeom>
+                    <a:ln/>
+                  </pic:spPr>
+                </pic:pic>
+              </a:graphicData>
+            </a:graphic>
+          </wp:inline>
+        </w:drawing>
+      </w:r>
+    </w:p>
+    <w:p>
+      <w:pPr>
+        <w:spacing w:after="120" w:line="480" w:lineRule="auto"/>
+        <w:ind w:firstLine="720"/>
+        <w:jc w:val="both"/>
+        <w:rPr>
+          <w:rFonts w:ascii="Arial Narrow" w:eastAsia="Arial Narrow" w:hAnsi="Arial Narrow" w:cs="Arial Narrow"/>
+          <w:sz w:val="24"/>
+          <w:szCs w:val="24"/>
+        </w:rPr>
+      </w:pPr>
+      <w:r>
+        <w:rPr>
+          <w:rFonts w:ascii="Arial Narrow" w:hAnsi="Arial Narrow" w:cs="Arial Narrow"/>
+          <w:sz w:val="24"/>
+        </w:rPr>
+        <w:t xml:space="preserve">Figure 2 traces one complete run through the components as built. After sign-in and profile creation against the managed backend, the camera setup step binds the front camera and feeds every frame through the MediaPipe Face Landmarker; the CalibrationGate admits the assessment only after fifteen consecutive frames in which a face and both irises are detected and the head is facing the screen, capturing a baseline orientation. In the assessment loop the ViewModel randomizes the category order from the validated stimulus dataset, the UI selects a curated clip, and each frame is reduced on-device to a screen-attention decision that the AttentionTracker accumulates into screen-attention proportion, gaze shifts, blink count, and time to first sustained lapse. A clip ends in one of three ways: it completes with attention maintained, after which two self-ratings are collected and the successful count increments; a sustained drop ends it early and the category is marked unsuccessful; or the user skips, with a first skip requeueing the category and a second retiring it. The loop ends at five successful assessments or, gracefully, when the category pool is exhausted. Scoring and recommendation then run entirely on the device, only derived metrics are written to Room, and the PDF report is generated from persisted rows.</w:t>
+      </w:r>
+    </w:p>
+    <w:p>
+      <w:pPr>
+        <w:pStyle w:val="Heading3"/>
+        <w:pageBreakBefore/>
+        <w:spacing w:before="280" w:after="280" w:line="480" w:lineRule="auto"/>
+        <w:rPr>
+          <w:rFonts w:ascii="Arial Narrow" w:eastAsia="Arial Narrow" w:hAnsi="Arial Narrow" w:cs="Arial Narrow"/>
+          <w:color w:val="000000"/>
+          <w:sz w:val="24"/>
+          <w:szCs w:val="24"/>
+        </w:rPr>
+      </w:pPr>
+      <w:r>
+        <w:rPr>
+          <w:rFonts w:ascii="Arial Narrow" w:eastAsia="Arial Narrow" w:hAnsi="Arial Narrow" w:cs="Arial Narrow"/>
+          <w:color w:val="000000"/>
+          <w:sz w:val="24"/>
+          <w:szCs w:val="24"/>
+        </w:rPr>
+        <w:t xml:space="preserve">Activity Diagram</w:t>
+      </w:r>
+    </w:p>
+    <w:p>
+      <w:pPr>
+        <w:keepNext/>
+        <w:pBdr>
+          <w:top w:val="nil"/>
+          <w:left w:val="nil"/>
+          <w:bottom w:val="nil"/>
+          <w:right w:val="nil"/>
+          <w:between w:val="nil"/>
+        </w:pBdr>
+        <w:spacing w:after="200" w:line="240" w:lineRule="auto"/>
+        <w:rPr>
+          <w:rFonts w:ascii="Arial Narrow" w:eastAsia="Arial Narrow" w:hAnsi="Arial Narrow" w:cs="Arial Narrow"/>
+          <w:i/>
+          <w:iCs/>
+          <w:color w:val="44546A"/>
+          <w:sz w:val="18"/>
+          <w:szCs w:val="18"/>
+        </w:rPr>
+      </w:pPr>
+      <w:r>
+        <w:rPr>
+          <w:rFonts w:ascii="Arial Narrow" w:eastAsia="Arial Narrow" w:hAnsi="Arial Narrow" w:cs="Arial Narrow"/>
+          <w:i/>
+          <w:iCs/>
+          <w:color w:val="44546A"/>
+          <w:sz w:val="18"/>
+          <w:szCs w:val="18"/>
+        </w:rPr>
+        <w:t xml:space="preserve">Figure 3 (a) Activity Diagram — onboarding, camera setup and assessment loop</w:t>
+      </w:r>
+    </w:p>
+    <w:p>
+      <w:pPr>
+        <w:spacing w:before="0" w:after="120" w:line="240" w:lineRule="auto"/>
+        <w:jc w:val="center"/>
+      </w:pPr>
+      <w:r>
+        <w:drawing>
+          <wp:inline distT="0" distB="0" distL="0" distR="0">
+            <wp:extent cx="5469054" cy="6766560"/>
+            <wp:effectExtent l="0" t="0" r="0" b="0"/>
+            <wp:docPr id="11" name="fig_activity_a.png"/>
+            <wp:cNvGraphicFramePr/>
+            <a:graphic xmlns:a="http://schemas.openxmlformats.org/drawingml/2006/main">
+              <a:graphicData uri="http://schemas.openxmlformats.org/drawingml/2006/picture">
+                <pic:pic xmlns:pic="http://schemas.openxmlformats.org/drawingml/2006/picture">
+                  <pic:nvPicPr>
+                    <pic:cNvPr id="0" name="fig_activity_a.png"/>
+                    <pic:cNvPicPr preferRelativeResize="0"/>
+                  </pic:nvPicPr>
+                  <pic:blipFill>
+                    <a:blip r:embed="rId101"/>
+                    <a:srcRect/>
+                    <a:stretch>
+                      <a:fillRect/>
+                    </a:stretch>
+                  </pic:blipFill>
+                  <pic:spPr>
+                    <a:xfrm>
+                      <a:off x="0" y="0"/>
+                      <a:ext cx="5469054" cy="6766560"/>
+                    </a:xfrm>
+                    <a:prstGeom prst="rect">
+                      <a:avLst/>
+                    </a:prstGeom>
+                    <a:ln/>
+                  </pic:spPr>
+                </pic:pic>
+              </a:graphicData>
+            </a:graphic>
+          </wp:inline>
+        </w:drawing>
+      </w:r>
+    </w:p>
+    <w:p>
+      <w:pPr>
+        <w:keepNext/>
+        <w:pBdr>
+          <w:top w:val="nil"/>
+          <w:left w:val="nil"/>
+          <w:bottom w:val="nil"/>
+          <w:right w:val="nil"/>
+          <w:between w:val="nil"/>
+        </w:pBdr>
+        <w:spacing w:after="200" w:line="240" w:lineRule="auto"/>
+        <w:rPr>
+          <w:rFonts w:ascii="Arial Narrow" w:eastAsia="Arial Narrow" w:hAnsi="Arial Narrow" w:cs="Arial Narrow"/>
+          <w:i/>
+          <w:iCs/>
+          <w:color w:val="44546A"/>
+          <w:sz w:val="18"/>
+          <w:szCs w:val="18"/>
+        </w:rPr>
+      </w:pPr>
+      <w:r>
+        <w:rPr>
+          <w:rFonts w:ascii="Arial Narrow" w:eastAsia="Arial Narrow" w:hAnsi="Arial Narrow" w:cs="Arial Narrow"/>
+          <w:i/>
+          <w:iCs/>
+          <w:color w:val="44546A"/>
+          <w:sz w:val="18"/>
+          <w:szCs w:val="18"/>
+        </w:rPr>
+        <w:t xml:space="preserve">Figure 3 (b) Activity Diagram — clip outcomes, scoring, profile and export (continued)</w:t>
+      </w:r>
+    </w:p>
+    <w:p>
+      <w:pPr>
+        <w:spacing w:before="0" w:after="120" w:line="240" w:lineRule="auto"/>
+        <w:jc w:val="center"/>
+      </w:pPr>
+      <w:r>
+        <w:drawing>
+          <wp:inline distT="0" distB="0" distL="0" distR="0">
+            <wp:extent cx="4967212" cy="6766560"/>
+            <wp:effectExtent l="0" t="0" r="0" b="0"/>
+            <wp:docPr id="12" name="fig_activity_b.png"/>
+            <wp:cNvGraphicFramePr/>
+            <a:graphic xmlns:a="http://schemas.openxmlformats.org/drawingml/2006/main">
+              <a:graphicData uri="http://schemas.openxmlformats.org/drawingml/2006/picture">
+                <pic:pic xmlns:pic="http://schemas.openxmlformats.org/drawingml/2006/picture">
+                  <pic:nvPicPr>
+                    <pic:cNvPr id="0" name="fig_activity_b.png"/>
+                    <pic:cNvPicPr preferRelativeResize="0"/>
+                  </pic:nvPicPr>
+                  <pic:blipFill>
+                    <a:blip r:embed="rId102"/>
+                    <a:srcRect/>
+                    <a:stretch>
+                      <a:fillRect/>
+                    </a:stretch>
+                  </pic:blipFill>
+                  <pic:spPr>
+                    <a:xfrm>
+                      <a:off x="0" y="0"/>
+                      <a:ext cx="4967212" cy="6766560"/>
+                    </a:xfrm>
+                    <a:prstGeom prst="rect">
+                      <a:avLst/>
+                    </a:prstGeom>
+                    <a:ln/>
+                  </pic:spPr>
+                </pic:pic>
+              </a:graphicData>
+            </a:graphic>
+          </wp:inline>
+        </w:drawing>
+      </w:r>
+    </w:p>
+    <w:p>
+      <w:pPr>
+        <w:spacing w:after="120" w:line="480" w:lineRule="auto"/>
+        <w:ind w:firstLine="720"/>
+        <w:jc w:val="both"/>
+        <w:rPr>
+          <w:rFonts w:ascii="Arial Narrow" w:eastAsia="Arial Narrow" w:hAnsi="Arial Narrow" w:cs="Arial Narrow"/>
+          <w:sz w:val="24"/>
+          <w:szCs w:val="24"/>
+        </w:rPr>
+      </w:pPr>
+      <w:r>
+        <w:rPr>
+          <w:rFonts w:ascii="Arial Narrow" w:hAnsi="Arial Narrow" w:cs="Arial Narrow"/>
+          <w:sz w:val="24"/>
+        </w:rPr>
+        <w:t xml:space="preserve">Figure 3 shows the user-facing flow. A registered user grants camera permission and completes the camera setup step, which loops until fifteen consecutive stable frames have been observed and a baseline head orientation captured. Categories are then presented in randomized order from the validated stimulus dataset. Each clip is tracked on-device and resolves to one of three outcomes: a sustained attention drop ends the clip early and marks the category unsuccessful; a skip requeues the category on first occurrence and retires it on the second; or the clip completes with attention maintained, the user supplies two self-ratings, and the successful count increments. The loop continues until five successful assessments are reached or the category pool is exhausted, in which case the session ends gracefully with whatever was measured. The per-category attention score is then computed, categories are ranked, trait clusters are aggregated across the strongest categories to infer a learning style, and study techniques, content formats, and weekly goals are generated. Derived metrics are saved locally, the results and recommendations are shown, and the user may export a PDF report or begin a new session.</w:t>
+      </w:r>
+    </w:p>
+    <w:p>
+      <w:pPr>
+        <w:pStyle w:val="Heading3"/>
+        <w:pageBreakBefore/>
+        <w:spacing w:before="280" w:after="280" w:line="480" w:lineRule="auto"/>
+        <w:rPr>
+          <w:rFonts w:ascii="Arial Narrow" w:eastAsia="Arial Narrow" w:hAnsi="Arial Narrow" w:cs="Arial Narrow"/>
+          <w:color w:val="000000"/>
+          <w:sz w:val="24"/>
+          <w:szCs w:val="24"/>
+        </w:rPr>
+      </w:pPr>
+      <w:r>
+        <w:rPr>
+          <w:rFonts w:ascii="Arial Narrow" w:eastAsia="Arial Narrow" w:hAnsi="Arial Narrow" w:cs="Arial Narrow"/>
+          <w:color w:val="000000"/>
+          <w:sz w:val="24"/>
+          <w:szCs w:val="24"/>
+        </w:rPr>
+        <w:t xml:space="preserve">Entity Relationship Diagram</w:t>
+      </w:r>
+    </w:p>
+    <w:p>
+      <w:pPr>
+        <w:keepNext/>
+        <w:pBdr>
+          <w:top w:val="nil"/>
+          <w:left w:val="nil"/>
+          <w:bottom w:val="nil"/>
+          <w:right w:val="nil"/>
+          <w:between w:val="nil"/>
+        </w:pBdr>
+        <w:spacing w:after="200" w:line="240" w:lineRule="auto"/>
+        <w:rPr>
+          <w:rFonts w:ascii="Arial Narrow" w:eastAsia="Arial Narrow" w:hAnsi="Arial Narrow" w:cs="Arial Narrow"/>
+          <w:i/>
+          <w:iCs/>
+          <w:color w:val="44546A"/>
+          <w:sz w:val="18"/>
+          <w:szCs w:val="18"/>
+        </w:rPr>
+      </w:pPr>
+      <w:r>
+        <w:rPr>
+          <w:rFonts w:ascii="Arial Narrow" w:eastAsia="Arial Narrow" w:hAnsi="Arial Narrow" w:cs="Arial Narrow"/>
+          <w:i/>
+          <w:iCs/>
+          <w:color w:val="44546A"/>
+          <w:sz w:val="18"/>
+          <w:szCs w:val="18"/>
+        </w:rPr>
+        <w:t xml:space="preserve">Figure 4 Entity Relationship Diagram</w:t>
+      </w:r>
+    </w:p>
+    <w:p>
+      <w:pPr>
+        <w:spacing w:before="0" w:after="120" w:line="240" w:lineRule="auto"/>
+        <w:jc w:val="center"/>
+      </w:pPr>
+      <w:r>
+        <w:drawing>
+          <wp:inline distT="0" distB="0" distL="0" distR="0">
+            <wp:extent cx="5486400" cy="3128087"/>
+            <wp:effectExtent l="0" t="0" r="0" b="0"/>
+            <wp:docPr id="13" name="fig_erd.png"/>
+            <wp:cNvGraphicFramePr/>
+            <a:graphic xmlns:a="http://schemas.openxmlformats.org/drawingml/2006/main">
+              <a:graphicData uri="http://schemas.openxmlformats.org/drawingml/2006/picture">
+                <pic:pic xmlns:pic="http://schemas.openxmlformats.org/drawingml/2006/picture">
+                  <pic:nvPicPr>
+                    <pic:cNvPr id="0" name="fig_erd.png"/>
+                    <pic:cNvPicPr preferRelativeResize="0"/>
+                  </pic:nvPicPr>
+                  <pic:blipFill>
+                    <a:blip r:embed="rId103"/>
+                    <a:srcRect/>
+                    <a:stretch>
+                      <a:fillRect/>
+                    </a:stretch>
+                  </pic:blipFill>
+                  <pic:spPr>
+                    <a:xfrm>
+                      <a:off x="0" y="0"/>
+                      <a:ext cx="5486400" cy="3128087"/>
+                    </a:xfrm>
+                    <a:prstGeom prst="rect">
+                      <a:avLst/>
+                    </a:prstGeom>
+                    <a:ln/>
+                  </pic:spPr>
+                </pic:pic>
+              </a:graphicData>
+            </a:graphic>
+          </wp:inline>
+        </w:drawing>
+      </w:r>
+    </w:p>
+    <w:p>
+      <w:pPr>
+        <w:spacing w:after="120" w:line="480" w:lineRule="auto"/>
+        <w:ind w:firstLine="720"/>
+        <w:jc w:val="both"/>
+        <w:rPr>
+          <w:rFonts w:ascii="Arial Narrow" w:eastAsia="Arial Narrow" w:hAnsi="Arial Narrow" w:cs="Arial Narrow"/>
+          <w:sz w:val="24"/>
+          <w:szCs w:val="24"/>
+        </w:rPr>
+      </w:pPr>
+      <w:r>
+        <w:rPr>
+          <w:rFonts w:ascii="Arial Narrow" w:hAnsi="Arial Narrow" w:cs="Arial Narrow"/>
+          <w:sz w:val="24"/>
+        </w:rPr>
+        <w:t xml:space="preserve">Figure 4 shows the data the system holds, separated by where it lives. The managed backend holds only the authentication user, the profile record, and the optional diagnosis document in a private bucket; no camera or gaze data ever reaches it. Local relational persistence in Room holds one assessment_history row per category per session, carrying the final score, its four gaze-based sub-scores, the two self-ratings, the underlying measurements (screen-attention percentage, gaze-shift count, blink count, first sustained lapse, watched duration), the measured analysis frame rate, capture-quality flags, and the successful, skipped, and skip-count fields that the session rule depends on, together with the self-reflection questionnaire responses. The stimulus library is a compiled dataset rather than a database: each stimulus belongs to exactly one canonical category, and each category maps to one or more trait clusters with weights that sum to one. The recommendation profile is derived at runtime from a session's rows and is not itself a table.</w:t>
       </w:r>
     </w:p>
     <w:p/>

</xml_diff>

<commit_message>
Tighten the prose in Chapters 1-2 of the paper
Shorter sentences, an explicit four-part system description, the three
acknowledged limitations stated as such, and a literature review that
argues the gap rather than listing sources. No technical claims changed.

Co-Authored-By: Claude Opus 5 <noreply@anthropic.com>
</commit_message>
<xml_diff>
--- a/docs/softengpaper-FocusFlow.docx
+++ b/docs/softengpaper-FocusFlow.docx
@@ -483,7 +483,7 @@
         <w:rPr>
           <w:rFonts w:ascii="Arial Narrow" w:hAnsi="Arial Narrow" w:cs="Arial"/>
         </w:rPr>
-        <w:t>This creates a practical problem distinct from the well-documented question of diagnostic accuracy. Even where attention difficulties are already recognized, the individual still has to decide what to actually work with day to day: which kinds of content hold their attention, and which lose it within seconds. In practice that decision is made by guesswork. Study advice is dispensed generically — read the chapter, take notes, avoid distractions with no reference to how a particular person's attention actually behaves, and the information needed to personalize it is generated in ordinary use, over hours rather than minutes, in the setting where the studying will actually happen.</w:t>
+        <w:t xml:space="preserve">This creates a practical problem that is distinct from the well-studied question of diagnostic accuracy. Even once attention difficulties are recognized, the individual still has to decide what to work with day to day — which kinds of content hold their attention and which lose it within seconds — and in practice that decision is made by guesswork. Study advice is dispensed generically (read the chapter, take notes, avoid distractions) with no reference to how a particular person's attention actually behaves. Yet the information needed to personalize such advice is produced in ordinary use, over hours rather than minutes, in the very setting where studying will happen.</w:t>
       </w:r>
     </w:p>
     <w:p>
@@ -561,7 +561,7 @@
           <w:rFonts w:ascii="Arial Narrow" w:hAnsi="Arial Narrow" w:cs="Arial Narrow"/>
           <w:sz w:val="24"/>
         </w:rPr>
-        <w:t xml:space="preserve">The purpose of this study is to design, implement, and evaluate FocusFlow, a self-contained Android application that profiles a user's attentional response to categorized media using only the hardware already present on a consumer smartphone or tablet, and converts that profile into personalized learning-style recommendations, study techniques, and weekly goals that the user can act on directly.</w:t>
+        <w:t xml:space="preserve">The purpose of this study is to design, implement, and evaluate FocusFlow, a self-contained Android application that profiles a user's attentional response to categorized media using only the hardware already present on a consumer smartphone or tablet, and turns that profile into learning-style recommendations, study techniques, and weekly goals the user can act on directly.</w:t>
       </w:r>
     </w:p>
     <w:p>
@@ -580,7 +580,7 @@
           <w:rFonts w:ascii="Arial Narrow" w:hAnsi="Arial Narrow" w:cs="Arial Narrow"/>
           <w:sz w:val="24"/>
         </w:rPr>
-        <w:t xml:space="preserve">The system is composed of four integrated parts. First, an on-device computer-vision pipeline binds the front-facing camera through CameraX ImageAnalysis and runs the MediaPipe Face Landmarker on every frame, recovering 478 facial landmarks including ten iris points, eight gaze-direction blendshape coefficients, and head orientation. A per-frame decision combines eye-gaze deflection with head yaw and pitch to determine whether the user is oriented toward the screen, and a temporal layer tracks screen-attention proportion, gaze shifts, blink count, and time to first sustained lapse, ending a clip early when attention has dropped for long enough. Second, a curated stimulus library delivers short video clips from nine content categories — Music, Gaming, Cartoon, Science Fiction, Education, Horror, Sadness, Melodrama, and Romance — through an embedded player using fixed, manually verified content identifiers, in randomized category order and under a per-clip duration cap; after each clip the user provides two short self-reported ratings.</w:t>
+        <w:t xml:space="preserve">The system has four integrated parts. The first is an on-device computer-vision pipeline: the front-facing camera is bound through CameraX ImageAnalysis, and every frame is passed to the MediaPipe Face Landmarker, which returns 478 facial landmarks including ten iris points, eight gaze-direction blendshape coefficients, and the head's orientation. From these, a per-frame decision combines eye-gaze deflection with head yaw and pitch to judge whether the user is oriented toward the screen, and a temporal layer accumulates screen-attention proportion, gaze shifts, blink count, and the time to the first sustained lapse, ending a clip early once attention has dropped for long enough. The second part is a curated stimulus library: short clips from nine content categories — Music, Gaming, Cartoon, Science Fiction, Education, Horror, Sadness, Melodrama, and Romance — delivered through an embedded player from fixed, manually verified content identifiers, in randomized category order and under a per-clip duration cap, with two brief self-ratings collected after each clip.</w:t>
       </w:r>
     </w:p>
     <w:p>
@@ -601,7 +601,7 @@
           <w:rFonts w:ascii="Arial Narrow" w:hAnsi="Arial Narrow" w:cs="Arial Narrow"/>
           <w:sz w:val="24"/>
         </w:rPr>
-        <w:t xml:space="preserve">Third, a scoring engine reduces the per-frame signals and ratings to a per-category attention score on a 0–100 scale as a documented weighted combination of screen attention, distraction delay, gaze stability, blink consistency, and the two self-reports, redistributing the self-report weight proportionally across the gaze-based components when ratings are unavailable; a session rule generates a profile only after five successful assessments, with bounded skip handling that retires a category after a second skip and terminates gracefully once the category pool is exhausted. Fourth, a recommendation engine ranks the categories, aggregates the trait clusters shared by the user's strongest categories, infers a dominant learning style, and generates study techniques, recommended content formats, and weekly goals, presented on a dashboard and exportable as a PDF report. Scored sessions are persisted locally; account, profile, and an optional diagnosis document are held in a managed backend. Camera frames are processed in memory on the device and are never stored or transmitted — only derived numerical metrics are retained. FocusFlow is an assistive self-reflection and study-habits tool intended to inform, not replace, professional judgement; it does not diagnose, screen for, or classify ADHD.</w:t>
+        <w:t xml:space="preserve">The third part is the scoring engine, which reduces the per-frame signals and self-ratings to a per-category attention score on a 0–100 scale. The score is a documented weighted combination of six components — screen attention, distraction delay, gaze stability, blink consistency, and the two self-reports — and when ratings are unavailable their weight is redistributed proportionally across the gaze-based components rather than dropped. A session rule governs when a profile may be produced: only after five successful assessments, with bounded skip handling that retires a category after a second skip and ends the session gracefully if the category pool is exhausted. The fourth part is the recommendation engine, which ranks the categories, aggregates the trait clusters shared by the user's strongest categories, infers a dominant learning style, and generates study techniques, recommended content formats, and weekly goals, presented on a dashboard and exportable as a PDF report. Scored sessions are stored locally; account, profile, and an optional diagnosis document are held in a managed backend. The privacy boundary is explicit: camera frames are processed in memory on the device and are never stored or transmitted, and only derived numerical metrics are retained. FocusFlow is an assistive self-reflection and study-habits tool intended to inform, not replace, professional judgement. It does not diagnose, screen for, or classify ADHD.</w:t>
       </w:r>
     </w:p>
     <w:p>
@@ -844,7 +844,7 @@
           <w:rFonts w:ascii="Arial Narrow" w:hAnsi="Arial Narrow" w:cs="Arial Narrow"/>
           <w:sz w:val="24"/>
         </w:rPr>
-        <w:t xml:space="preserve">This study covers the development of a self-contained Android application in Kotlin and Jetpack Compose, following an MVVM architecture with a repository layer and targeting Android 8.0 (API level 26) and above. The scope includes on-device acquisition and feature extraction from the front-facing camera using CameraX and the MediaPipe Face Landmarker; a per-frame attention decision combining eye-gaze deflection with head yaw and pitch; a temporal layer measuring screen-attention proportion, gaze shifts, blink count, and time to first sustained lapse; computation of a per-category attention score on a 0–100 scale; a curated stimulus library of nine content categories with randomized presentation order and a per-clip duration cap; a session rule requiring five successful assessments with bounded skip handling; inference of a dominant learning style with recommended study techniques, content formats, and weekly goals; and account management, onboarding, local relational persistence of scored sessions, and export of the resulting report as a PDF.</w:t>
+        <w:t xml:space="preserve">This study covers the development of a self-contained Android application in Kotlin and Jetpack Compose, built on an MVVM architecture with a repository layer and targeting Android 8.0 (API level 26) and above. Within scope are: on-device acquisition and feature extraction from the front-facing camera using CameraX and the MediaPipe Face Landmarker; a per-frame attention decision that combines eye-gaze deflection with head yaw and pitch; a temporal layer measuring screen-attention proportion, gaze shifts, blink count, and time to first sustained lapse; a per-category attention score on a 0–100 scale; a curated library of nine content categories with randomized presentation order and a per-clip duration cap; a session rule requiring five successful assessments with bounded skip handling; inference of a dominant learning style with recommended study techniques, content formats, and weekly goals; and account management, onboarding, local relational persistence of scored sessions, and export of the resulting report as a PDF.</w:t>
       </w:r>
     </w:p>
     <w:p>
@@ -863,7 +863,7 @@
           <w:rFonts w:ascii="Arial Narrow" w:hAnsi="Arial Narrow" w:cs="Arial Narrow"/>
           <w:sz w:val="24"/>
         </w:rPr>
-        <w:t xml:space="preserve">The system is evaluated on team-owned Android devices in ordinary study settings; it is operated by the user directly and requires no specialist supervision, with minors expected to use it under guardian involvement during account setup and the camera setup step. Age-appropriate filtering of the stimulus categories is not implemented in the current build, so all nine categories are presented to every user regardless of age; this is a known limitation carried into the next iteration. In the absence of an external criterion measure of attention, the attention-score component weights are a stated design prior rather than empirically calibrated values. The approved system measures gaze deflection rather than calibrated point-of-regard; as a post-approval enhancement, the current build additionally incorporates the iTracker model (Krafka et al., 2016) with a short per-user calibration to provide an approximate, centimetre-level estimate of screen position, used only when the calibration fit is within tolerance and falling back automatically to the deflection-based pipeline otherwise. The iTracker model is used under a research-only licence.</w:t>
+        <w:t xml:space="preserve">The system is evaluated on team-owned Android devices in ordinary study settings. It is operated by the user directly and needs no specialist supervision, though minors are expected to use it with a guardian present during account setup and the camera setup step. Three limitations are acknowledged. Age-appropriate filtering of the stimulus categories is not implemented in the current build, so all nine categories are presented to every user regardless of age; this is a known limitation carried into the next iteration. Because no external criterion measure of attention is available, the attention-score component weights are a stated design prior rather than empirically calibrated values, which is why the objectives include a sensitivity analysis over alternative weightings. Finally, the approved system measures gaze deflection rather than calibrated point-of-regard. As a post-approval enhancement, the current build also incorporates the iTracker model (Krafka et al., 2016) with a short per-user calibration to give an approximate, centimetre-level estimate of screen position; it is used only when the calibration fit is within tolerance and otherwise falls back automatically to the deflection-based pipeline. The iTracker model is used under a research-only licence.</w:t>
       </w:r>
     </w:p>
     <w:p>
@@ -884,7 +884,7 @@
           <w:rFonts w:ascii="Arial Narrow" w:hAnsi="Arial Narrow" w:cs="Arial Narrow"/>
           <w:sz w:val="24"/>
         </w:rPr>
-        <w:t xml:space="preserve">The following are outside the scope of this study: diagnostic classification or screening for ADHD — the system characterizes content preference and attention patterns, not diagnostic status; any external sensor, microcontroller, or hardware peripheral, since all sensing is performed by the device's own front-facing camera; transmission of video frames, facial landmarks, or any derived per-frame feature off the device, with remote services limited to authentication, the user profile record, optional diagnosis-document storage, and streaming of the stimulus videos; native iOS or web-based companion versions during the initial project term; and prescription of treatment.</w:t>
+        <w:t xml:space="preserve">The following are outside the scope of this study: diagnostic classification or screening for ADHD, since the system characterizes content preference and attention patterns rather than diagnostic status; any external sensor, microcontroller, or hardware peripheral, since all sensing is performed by the device's own front-facing camera; transmission of video frames, facial landmarks, or any derived per-frame feature off the device, with remote services limited to authentication, the user profile record, optional diagnosis-document storage, and streaming of the stimulus videos; native iOS or web-based companion versions during the initial project term; and prescription or alteration of treatment.</w:t>
       </w:r>
     </w:p>
     <w:p>
@@ -1799,7 +1799,7 @@
           <w:rFonts w:ascii="Arial Narrow" w:hAnsi="Arial Narrow" w:cs="Arial Narrow"/>
           <w:sz w:val="24"/>
         </w:rPr>
-        <w:t xml:space="preserve">Taken together, the reviewed literature shows three mature but separate streams: computer-vision work that makes gaze measurable with ordinary device cameras; clinical and epidemiological work that establishes ocular behaviour as an attention-related signal and quantifies the population concerned; and digital-intervention work that delivers attention support through games and structured tasks. No reviewed system closes the loop by using a consumer phone's own camera to profile which categories of content sustain an individual's attention and translating that profile into study recommendations. This study addresses that gap.</w:t>
+        <w:t xml:space="preserve">The reviewed literature falls into three mature but largely separate streams. Computer-vision research has made gaze measurable with the cameras already built into consumer devices. Clinical and epidemiological research has established ocular behaviour as an attention-related signal and quantified the population for whom attention support matters. Digital-intervention research has shown that games and structured tasks can deliver that support. What none of these streams does is close the loop: use a phone's own camera to learn which categories of content sustain a particular person's attention, and translate that into how they study. That is the gap this study addresses.</w:t>
       </w:r>
     </w:p>
     <w:p>
@@ -1851,7 +1851,7 @@
           <w:rFonts w:ascii="Arial Narrow" w:hAnsi="Arial Narrow" w:cs="Arial Narrow"/>
           <w:sz w:val="24"/>
         </w:rPr>
-        <w:t xml:space="preserve">Estimating where a person is looking traditionally required dedicated infrared eye trackers, and toolboxes such as PyGaze (Dalmaijer, Mathôt, &amp; Van der Stigchel, 2014) standardised experiment programming around such hardware. Krafka et al. (2016) demonstrated that a convolutional network trained on a large crowdsourced dataset can estimate point of regard from a phone or tablet front camera alone, establishing that consumer devices carry sufficient sensing capability. Kartynnik, Ablavatski, Grishchenko, and Grundmann (2019) showed that a dense facial surface can be recovered from monocular video in real time on mobile GPUs — the model underlying the MediaPipe Face Landmarker used in this study. Bott et al. (2018) validated eye-tracking measures from device-embedded cameras against established cognitive composites, and Park et al. (2025) showed that correcting for head motion materially improves gaze accuracy, which is why FocusFlow evaluates eye-gaze deflection together with head yaw and pitch rather than in isolation. These works make gaze measurable on ordinary devices, but they stop at measurement; none asks what the measured attention means for how a particular person should study.</w:t>
+        <w:t xml:space="preserve">Estimating where a person is looking once required dedicated infrared eye trackers, and toolboxes such as PyGaze (Dalmaijer, Mathôt, &amp; Van der Stigchel, 2014) grew up around that hardware. Krafka et al. (2016) changed the premise by showing that a convolutional network trained on a large crowdsourced dataset can estimate point of regard from a phone or tablet's front camera alone. Kartynnik, Ablavatski, Grishchenko, and Grundmann (2019) then showed that a dense facial surface can be recovered from monocular video in real time on mobile GPUs — the model underlying the MediaPipe Face Landmarker used in this study. Two further results shape FocusFlow's design. Bott et al. (2018) validated eye-tracking measures from device-embedded cameras against established cognitive composites, supporting their use as more than a novelty; and Park et al. (2025) showed that correcting for head motion materially improves gaze accuracy, which is why FocusFlow evaluates eye-gaze deflection together with head yaw and pitch rather than in isolation. This stream makes gaze measurable on ordinary devices, but it stops at measurement: none of it asks what the measured attention means for how a particular person should study.</w:t>
       </w:r>
     </w:p>
     <w:p>
@@ -1889,7 +1889,7 @@
           <w:rFonts w:ascii="Arial Narrow" w:hAnsi="Arial Narrow" w:cs="Arial Narrow"/>
           <w:sz w:val="24"/>
         </w:rPr>
-        <w:t xml:space="preserve">A second stream connects ocular measures to attention in populations with ADHD. Groen, Borger, Koerts, Thome, and Tucha (2017) examined blink rate and blink timing in children with ADHD, motivating blink behaviour as a soft, indirect attention correlate — which is why blink consistency enters the FocusFlow score with the smallest weight. Lee, Yeung, Sze, and Chan (2021) showed that eye-tracking-based training improves inhibitory control, indicating that ocular measures are not merely descriptive but actionable. Liu et al. (2024) demonstrated that eye-tracking-derived digital biomarkers can distinguish ADHD from control groups, and Loh et al. (2022) reviewed automated detection approaches across modalities. Across this stream the consistent orientation is diagnostic classification; the same signals are rarely turned back toward the individual as feedback about their own engagement with particular content.</w:t>
+        <w:t xml:space="preserve">A second stream connects ocular measures to attention in people with ADHD. Groen, Borger, Koerts, Thome, and Tucha (2017) examined blink rate and blink timing in children with ADHD, which is why blink behaviour enters FocusFlow's score at all — and why, as a soft and indirect correlate, it carries the smallest weight. Lee, Yeung, Sze, and Chan (2021) showed that eye-tracking-based training improves inhibitory control, indicating that ocular measures are not merely descriptive but can be acted on. Liu et al. (2024) demonstrated that eye-tracking-derived digital biomarkers can distinguish children with ADHD from controls, and Loh et al. (2022) surveyed automated detection approaches across signal modalities. The consistent orientation of this stream is diagnostic classification. The same signals are rarely turned back toward the individual as feedback about their own engagement with particular content, which is precisely the use FocusFlow makes of them.</w:t>
       </w:r>
     </w:p>
     <w:p>
@@ -1927,7 +1927,7 @@
           <w:rFonts w:ascii="Arial Narrow" w:hAnsi="Arial Narrow" w:cs="Arial Narrow"/>
           <w:sz w:val="24"/>
         </w:rPr>
-        <w:t xml:space="preserve">Behavioural sensing is not the only informative input. Christiansen et al. (2020) applied machine learning to structured self-report rating scales for adult ADHD, showing that short, structured self-reports carry usable signal. FocusFlow collects two brief post-clip ratings for the same reason, but treats them as a complement to the gaze-based measures rather than a substitute: they carry a small, documented weight, and when they are unavailable that weight is redistributed proportionally across the objective components so that a session without ratings is not silently scored on a smaller scale.</w:t>
+        <w:t xml:space="preserve">Behavioural sensing is not the only informative input. Christiansen et al. (2020) applied machine learning to structured self-report rating scales for adult ADHD, showing that short, structured self-reports carry usable signal. FocusFlow collects two brief post-clip ratings for the same reason, but treats them as a complement to the gaze-based measures rather than a substitute. They carry a small, documented weight, and when they are absent that weight is redistributed proportionally across the objective components, so a session without ratings is scored on the same scale as one with them.</w:t>
       </w:r>
     </w:p>
     <w:p>
@@ -1965,7 +1965,7 @@
           <w:rFonts w:ascii="Arial Narrow" w:hAnsi="Arial Narrow" w:cs="Arial Narrow"/>
           <w:sz w:val="24"/>
         </w:rPr>
-        <w:t xml:space="preserve">A third stream delivers attention support through technology. Doulou, Pergantis, Drigas, and Skianis (2025) systematically reviewed serious games for managing ADHD symptoms, and Kollins et al. (2020) reported a randomised controlled trial of a game-delivered digital intervention with measurable attention outcomes; Davis, Bower, and Kollins (2018) established the feasibility of delivering such an intervention at home. Luo, Zhang, Xia, and Zhou (2023) combined behavioural training with EEG biofeedback, and Ouyang et al. (2026) used an instrumented chair to measure movement objectively in a simulated classroom, both illustrating the demand for objective rather than recall-based measures. These interventions are effective but are prescribed generically: whether a given format suits a given individual is not itself measured, and the objective-measurement approaches depend on specialised hardware unavailable in everyday study settings. Salari et al. (2023) quantify the scale of the population for whom this matters.</w:t>
+        <w:t xml:space="preserve">A third stream delivers attention support through technology. Doulou, Pergantis, Drigas, and Skianis (2025) systematically reviewed serious games for managing ADHD symptoms; Kollins et al. (2020) reported a randomised controlled trial of a game-delivered digital intervention with measurable attention outcomes; and Davis, Bower, and Kollins (2018) established that such an intervention can be delivered at home. Two further studies illustrate the demand for objective rather than recall-based measurement: Luo, Zhang, Xia, and Zhou (2023) combined behavioural training with EEG biofeedback, and Ouyang et al. (2026) used an instrumented chair to measure movement in a simulated classroom. These interventions work, but they are prescribed generically — whether a given format suits a given individual is not itself measured — and the objective-measurement approaches depend on specialised hardware that is absent from everyday study settings. Salari et al. (2023) quantify how large the affected population is, and therefore how much this matters.</w:t>
       </w:r>
     </w:p>
     <w:p>
@@ -2000,7 +2000,7 @@
           <w:rFonts w:ascii="Arial Narrow" w:hAnsi="Arial Narrow" w:cs="Arial Narrow"/>
           <w:sz w:val="24"/>
         </w:rPr>
-        <w:t xml:space="preserve">The gap between these streams is the one FocusFlow occupies. Gaze can be measured on a consumer phone; ocular behaviour is an established attention correlate; and digital interventions work but are not personalised to the individual's measured attention. FocusFlow combines on-device face-landmark inference with a temporal attention layer and a transparent, sensitivity-checked scoring design to profile which of nine content categories sustain a user's attention, and converts that profile into learning-style recommendations, study techniques, and weekly goals — while explicitly declining to diagnose, screen for, or classify ADHD, and while keeping every camera frame on the device.</w:t>
+        <w:t xml:space="preserve">The gap between these streams is the one FocusFlow occupies. Gaze can be measured on a consumer phone; ocular behaviour is an established attention correlate; digital interventions work but are not personalised to the individual's measured attention. FocusFlow joins the three: on-device face-landmark inference feeds a temporal attention layer and a transparent, sensitivity-checked scoring design that profiles which of nine content categories sustain a user's attention, and that profile is converted into learning-style recommendations, study techniques, and weekly goals. It does so while explicitly declining to diagnose, screen for, or classify ADHD, and while keeping every camera frame on the device.</w:t>
       </w:r>
     </w:p>
     <w:p>

</xml_diff>